<commit_message>
Update daily log templates
</commit_message>
<xml_diff>
--- a/classroom/project-packager/templates/daily-log/TYPE_MIX_복합_일지_양식.docx
+++ b/classroom/project-packager/templates/daily-log/TYPE_MIX_복합_일지_양식.docx
@@ -4,7 +4,7 @@
   <w:body>
     <w:p>
       <w:pPr>
-        <w:pStyle w:val="Title"/>
+        <w:pStyle w:val="DailyTitle"/>
       </w:pPr>
       <w:r>
         <w:rPr>
@@ -18,7 +18,7 @@
     </w:p>
     <w:p>
       <w:pPr>
-        <w:pStyle w:val="title_info"/>
+        <w:pStyle w:val="DailyInfo"/>
         <w:jc w:val="right"/>
       </w:pPr>
       <w:r>
@@ -32,7 +32,7 @@
     </w:p>
     <w:p>
       <w:pPr>
-        <w:pStyle w:val="title_info"/>
+        <w:pStyle w:val="DailyInfo"/>
         <w:jc w:val="right"/>
       </w:pPr>
       <w:r>
@@ -45,6 +45,9 @@
       </w:r>
     </w:p>
     <w:p>
+      <w:pPr>
+        <w:pStyle w:val="DailyInfo"/>
+      </w:pPr>
       <w:r>
         <w:rPr>
           <w:rFonts w:ascii="맑은 고딕" w:hAnsi="맑은 고딕" w:eastAsia="맑은 고딕" w:cs="맑은 고딕"/>
@@ -56,7 +59,7 @@
     </w:p>
     <w:p>
       <w:pPr>
-        <w:pStyle w:val="Heading1"/>
+        <w:pStyle w:val="DailySectionHeading"/>
       </w:pPr>
       <w:r>
         <w:rPr>
@@ -70,7 +73,7 @@
     </w:p>
     <w:p>
       <w:pPr>
-        <w:pStyle w:val="Heading2"/>
+        <w:pStyle w:val="DailySubheading"/>
       </w:pPr>
       <w:r>
         <w:rPr>
@@ -250,7 +253,7 @@
     </w:p>
     <w:p>
       <w:pPr>
-        <w:pStyle w:val="Heading2"/>
+        <w:pStyle w:val="DailySubheading"/>
       </w:pPr>
       <w:r>
         <w:rPr>
@@ -417,7 +420,7 @@
     </w:p>
     <w:p>
       <w:pPr>
-        <w:pStyle w:val="Heading2"/>
+        <w:pStyle w:val="DailySubheading"/>
       </w:pPr>
       <w:r>
         <w:rPr>
@@ -584,7 +587,7 @@
     </w:p>
     <w:p>
       <w:pPr>
-        <w:pStyle w:val="Heading2"/>
+        <w:pStyle w:val="DailySubheading"/>
       </w:pPr>
       <w:r>
         <w:rPr>
@@ -624,7 +627,7 @@
     </w:p>
     <w:p>
       <w:pPr>
-        <w:pStyle w:val="Heading1"/>
+        <w:pStyle w:val="DailySectionHeading"/>
       </w:pPr>
       <w:r>
         <w:rPr>
@@ -638,7 +641,7 @@
     </w:p>
     <w:p>
       <w:pPr>
-        <w:pStyle w:val="Heading2"/>
+        <w:pStyle w:val="DailySubheading"/>
       </w:pPr>
       <w:r>
         <w:rPr>
@@ -665,7 +668,7 @@
     </w:p>
     <w:p>
       <w:pPr>
-        <w:pStyle w:val="Heading2"/>
+        <w:pStyle w:val="DailySubheading"/>
       </w:pPr>
       <w:r>
         <w:rPr>
@@ -692,7 +695,7 @@
     </w:p>
     <w:p>
       <w:pPr>
-        <w:pStyle w:val="Heading1"/>
+        <w:pStyle w:val="DailySectionHeading"/>
       </w:pPr>
       <w:r>
         <w:rPr>
@@ -706,7 +709,7 @@
     </w:p>
     <w:p>
       <w:pPr>
-        <w:pStyle w:val="Heading2"/>
+        <w:pStyle w:val="DailySubheading"/>
       </w:pPr>
       <w:r>
         <w:rPr>
@@ -1083,7 +1086,7 @@
     </w:tbl>
     <w:p>
       <w:pPr>
-        <w:pStyle w:val="Heading1"/>
+        <w:pStyle w:val="DailySectionHeading"/>
       </w:pPr>
       <w:r>
         <w:rPr>
@@ -1110,7 +1113,7 @@
     </w:p>
     <w:p>
       <w:pPr>
-        <w:pStyle w:val="Heading2"/>
+        <w:pStyle w:val="DailySectionHeading"/>
       </w:pPr>
       <w:r>
         <w:rPr>
@@ -1119,7 +1122,7 @@
           <w:color w:val="000000"/>
           <w:sz w:val="24"/>
         </w:rPr>
-        <w:t>첨부 자료</w:t>
+        <w:t>참고자료</w:t>
       </w:r>
     </w:p>
     <w:p>
@@ -13218,6 +13221,85 @@
       <w:b w:val="0"/>
       <w:color w:val="000000"/>
       <w:sz w:val="20"/>
+    </w:rPr>
+  </w:style>
+  <w:style w:type="paragraph" w:customStyle="1" w:styleId="DailyTitle">
+    <w:name w:val="DailyTitle"/>
+    <w:basedOn w:val="Normal"/>
+    <w:qFormat/>
+    <w:pPr>
+      <w:keepNext/>
+      <w:spacing w:after="120"/>
+      <w:jc w:val="center"/>
+    </w:pPr>
+    <w:rPr>
+      <w:rFonts w:cs="Malgun Gothic"/>
+      <w:b/>
+      <w:color w:val="000000"/>
+      <w:sz w:val="32"/>
+      <w:szCs w:val="32"/>
+      <w:lang w:eastAsia="ko-KR"/>
+    </w:rPr>
+  </w:style>
+  <w:style w:type="paragraph" w:customStyle="1" w:styleId="DailyInfo">
+    <w:name w:val="DailyInfo"/>
+    <w:basedOn w:val="Normal"/>
+    <w:qFormat/>
+    <w:pPr>
+      <w:spacing w:after="0"/>
+      <w:jc w:val="right"/>
+    </w:pPr>
+    <w:rPr>
+      <w:rFonts w:cs="Malgun Gothic"/>
+      <w:color w:val="000000"/>
+      <w:lang w:eastAsia="ko-KR"/>
+    </w:rPr>
+  </w:style>
+  <w:style w:type="paragraph" w:customStyle="1" w:styleId="DailySectionHeading">
+    <w:name w:val="DailySectionHeading"/>
+    <w:basedOn w:val="Normal"/>
+    <w:qFormat/>
+    <w:pPr>
+      <w:keepNext/>
+      <w:spacing w:before="240" w:after="80"/>
+    </w:pPr>
+    <w:rPr>
+      <w:rFonts w:cs="Malgun Gothic"/>
+      <w:b/>
+      <w:color w:val="000000"/>
+      <w:sz w:val="28"/>
+      <w:szCs w:val="28"/>
+      <w:lang w:eastAsia="ko-KR"/>
+    </w:rPr>
+  </w:style>
+  <w:style w:type="paragraph" w:customStyle="1" w:styleId="DailySubheading">
+    <w:name w:val="DailySubheading"/>
+    <w:basedOn w:val="Normal"/>
+    <w:qFormat/>
+    <w:pPr>
+      <w:keepNext/>
+      <w:spacing w:before="120" w:after="40"/>
+    </w:pPr>
+    <w:rPr>
+      <w:rFonts w:cs="Malgun Gothic"/>
+      <w:b/>
+      <w:color w:val="000000"/>
+      <w:lang w:eastAsia="ko-KR"/>
+    </w:rPr>
+  </w:style>
+  <w:style w:type="paragraph" w:customStyle="1" w:styleId="DailyReferenceItem">
+    <w:name w:val="DailyReferenceItem"/>
+    <w:basedOn w:val="Normal"/>
+    <w:qFormat/>
+    <w:pPr>
+      <w:spacing w:after="40"/>
+    </w:pPr>
+    <w:rPr>
+      <w:rFonts w:cs="Malgun Gothic"/>
+      <w:color w:val="000000"/>
+      <w:sz w:val="21"/>
+      <w:szCs w:val="21"/>
+      <w:lang w:eastAsia="ko-KR"/>
     </w:rPr>
   </w:style>
 </w:styles>

</xml_diff>